<commit_message>
Fix the stay settle step: the rebuild now really uses the settled stays
The build closure was an arrow function, which copies $stays when it is created, so every
rebuild repeated the first stays and the guard never accepted a better plan. The closure now
shares the stays by reference. Adds a regression test with the real generator, targeted tests
for the Commutable transfer path, and a labelled (unapproved, provisional) documentation section.

Co-Authored-By: Claude Sonnet 5.5 <noreply@anthropic.com>
</commit_message>
<xml_diff>
--- a/docs/ExploreDVO_Development_Documentation.docx
+++ b/docs/ExploreDVO_Development_Documentation.docx
@@ -15201,6 +15201,27 @@
           <w:sz w:val="22"/>
         </w:rPr>
         <w:t>This document will continue to be updated as a living record each time new work is done on the system, following the same twelve-category structure for any new module.</w:t>
+      </w:r>
+    </w:p>
+    <w:p>
+      <w:pPr>
+        <w:pStyle w:val="Heading1"/>
+      </w:pPr>
+      <w:r>
+        <w:t>Addendum (30 October 2026): Work in Progress, Not Merged: Where the Traveller Stays</w:t>
+      </w:r>
+    </w:p>
+    <w:p>
+      <w:r>
+        <w:rPr>
+          <w:b/>
+        </w:rPr>
+        <w:t>STATUS: implemented on the local branch feature/stay-continuity-stage1. NOT approved for merging. NOT deployed. The figures below were measured on test data in a scratch copy of the database and are provisional, not final results.</w:t>
+      </w:r>
+    </w:p>
+    <w:p>
+      <w:r>
+        <w:t>This addendum records unmerged work so the documentation does not silently describe it as part of the system. The itinerary generator (ItineraryGenerationService) picks one stay per night; the branch changes this to a whole-trip stay plan governed by the traveller's distance preference, settled on the stops actually placed, with a rebuild guard (StayPlanEvaluator) and a new nullable column itineraries.stay_plan. A defect found in the settle step (the rebuild repeated the first stays) has been fixed on the branch. Full details, the database change and provisional measurements are in ExploreDVO_Implementation_Changes.docx, section 9. Accreditation records and stay prices remain temporary test data, not verified DOT information.</w:t>
       </w:r>
     </w:p>
     <w:sectPr>

</xml_diff>